<commit_message>
faq-builder: regenerate PrimeroEdge FAQ deliverables + add audit/reconcile tooling
- Regenerated all PrimeroEdge FAQ deliverables (docx + pdf) and updated build specs
- Added build/audit/ reports, reconcile_audit.py, finalize.py, build_rejected_xlsx.py
- Added rejected-tickets reconciliation workbooks + SOP.md

Co-Authored-By: Claude Opus 4.8 (1M context) <noreply@anthropic.com>
</commit_message>
<xml_diff>
--- a/faq-builder/deliverables/PrimeroEdge-Assign-Menus-FAQ.docx
+++ b/faq-builder/deliverables/PrimeroEdge-Assign-Menus-FAQ.docx
@@ -183,7 +183,7 @@
           <w:color w:val="8A8A8A"/>
           <w:sz w:val="17"/>
         </w:rPr>
-        <w:t>Source support cases: Tickets 300119, 304375, 320208, 315799, 318907</w:t>
+        <w:t>Source support cases: Tickets 300119, 304375, 320208, 318907</w:t>
       </w:r>
     </w:p>
     <w:p>
@@ -352,7 +352,7 @@
           <w:color w:val="8A8A8A"/>
           <w:sz w:val="17"/>
         </w:rPr>
-        <w:t>Source support cases: Tickets 293130, 294583, 298386, 294120</w:t>
+        <w:t>Source support cases: Tickets 293130, 294583, 298386</w:t>
       </w:r>
     </w:p>
     <w:p>
@@ -713,7 +713,7 @@
           <w:color w:val="8A8A8A"/>
           <w:sz w:val="17"/>
         </w:rPr>
-        <w:t>Source support cases: Tickets 292177, 301451, 304395, 298114</w:t>
+        <w:t>Source support cases: Tickets 292177, 301451, 304395</w:t>
       </w:r>
     </w:p>
     <w:p>
@@ -1090,7 +1090,7 @@
           <w:color w:val="8A8A8A"/>
           <w:sz w:val="17"/>
         </w:rPr>
-        <w:t>Source support cases: Tickets 292173, 294022, 310877</w:t>
+        <w:t>Source support cases: Tickets 292173, 294022</w:t>
       </w:r>
     </w:p>
     <w:p>
@@ -1349,7 +1349,7 @@
           <w:color w:val="8A8A8A"/>
           <w:sz w:val="17"/>
         </w:rPr>
-        <w:t>Source support cases: Tickets 304375, 320213, 320208, 305356</w:t>
+        <w:t>Source support cases: Tickets 304375, 320208</w:t>
       </w:r>
     </w:p>
     <w:p>
@@ -1530,61 +1530,6 @@
           <w:sz w:val="17"/>
         </w:rPr>
         <w:t>Source support cases: Tickets 290474</w:t>
-      </w:r>
-    </w:p>
-    <w:p>
-      <w:pPr>
-        <w:spacing w:before="200" w:after="120"/>
-        <w:pBdr>
-          <w:bottom w:val="single" w:sz="6" w:space="1" w:color="2E7D8A"/>
-        </w:pBdr>
-      </w:pPr>
-      <w:r>
-        <w:rPr>
-          <w:b/>
-          <w:color w:val="1F3A5F"/>
-          <w:sz w:val="30"/>
-        </w:rPr>
-        <w:t>Additional source cases reviewed</w:t>
-      </w:r>
-    </w:p>
-    <w:p>
-      <w:pPr>
-        <w:spacing w:before="160" w:after="40"/>
-      </w:pPr>
-      <w:r>
-        <w:rPr>
-          <w:b/>
-          <w:color w:val="2E7D8A"/>
-          <w:sz w:val="23"/>
-        </w:rPr>
-        <w:t>Q29.  Which other support cases were reviewed for this guide?</w:t>
-      </w:r>
-    </w:p>
-    <w:p>
-      <w:pPr>
-        <w:spacing w:after="80"/>
-        <w:ind w:left="317"/>
-      </w:pPr>
-      <w:r>
-        <w:rPr>
-          <w:sz w:val="22"/>
-        </w:rPr>
-        <w:t>These additional cases from the source filter were reviewed while building this guide. Each was resolved without distinct new guidance - for example a transient error cleared by refreshing, a question the requester resolved on their own, or a one-off configuration or data fix handled directly with the support team - and is listed here so the guide accounts for every case in the source filter.</w:t>
-      </w:r>
-    </w:p>
-    <w:p>
-      <w:pPr>
-        <w:spacing w:after="160"/>
-        <w:ind w:left="317"/>
-      </w:pPr>
-      <w:r>
-        <w:rPr>
-          <w:i/>
-          <w:color w:val="8A8A8A"/>
-          <w:sz w:val="17"/>
-        </w:rPr>
-        <w:t>Source support cases: Tickets 292559, 296617, 296678, 304343, 307298, 307341, 312880, 313547, 315415, 315592, 316770, 319957, 320468</w:t>
       </w:r>
     </w:p>
     <w:p>

</xml_diff>